<commit_message>
Added pdf and OneDrive link
</commit_message>
<xml_diff>
--- a/Dissertation Report.docx
+++ b/Dissertation Report.docx
@@ -218,7 +218,7 @@
                         <a:effectLst/>
                         <a:extLst>
                           <a:ext uri="{C572A759-6A51-4108-AA02-DFA0A04FC94B}">
-                            <ma14:wrappingTextBoxFlag xmlns:ma14="http://schemas.microsoft.com/office/mac/drawingml/2011/main" xmlns:w="http://schemas.openxmlformats.org/wordprocessingml/2006/main" xmlns:w10="urn:schemas-microsoft-com:office:word" xmlns:v="urn:schemas-microsoft-com:vml" xmlns:o="urn:schemas-microsoft-com:office:office" xmlns:mv="urn:schemas-microsoft-com:mac:vml" xmlns:mo="http://schemas.microsoft.com/office/mac/office/2008/main" xmlns=""/>
+                            <ma14:wrappingTextBoxFlag xmlns="" xmlns:mo="http://schemas.microsoft.com/office/mac/office/2008/main" xmlns:mv="urn:schemas-microsoft-com:mac:vml" xmlns:o="urn:schemas-microsoft-com:office:office" xmlns:v="urn:schemas-microsoft-com:vml" xmlns:w10="urn:schemas-microsoft-com:office:word" xmlns:w="http://schemas.openxmlformats.org/wordprocessingml/2006/main" xmlns:ma14="http://schemas.microsoft.com/office/mac/drawingml/2011/main"/>
                           </a:ext>
                         </a:extLst>
                       </wps:spPr>
@@ -740,7 +740,79 @@
             <w:sz w:val="18"/>
             <w:szCs w:val="18"/>
           </w:rPr>
-          <w:t>https://githu</w:t>
+          <w:t>https://github.com/heyitsnick4/CCTP</w:t>
+        </w:r>
+      </w:hyperlink>
+    </w:p>
+    <w:p>
+      <w:pPr>
+        <w:pStyle w:val="BodyText"/>
+        <w:rPr>
+          <w:rFonts w:ascii="Verdana" w:hAnsi="Verdana"/>
+          <w:sz w:val="18"/>
+          <w:szCs w:val="18"/>
+          <w:lang w:val="en-GB"/>
+        </w:rPr>
+      </w:pPr>
+      <w:r>
+        <w:rPr>
+          <w:rFonts w:ascii="Verdana" w:hAnsi="Verdana"/>
+          <w:sz w:val="18"/>
+          <w:szCs w:val="18"/>
+        </w:rPr>
+        <w:t xml:space="preserve">The video </w:t>
+      </w:r>
+      <w:r>
+        <w:rPr>
+          <w:rFonts w:ascii="Verdana" w:hAnsi="Verdana"/>
+          <w:sz w:val="18"/>
+          <w:szCs w:val="18"/>
+          <w:lang w:val="en-GB"/>
+        </w:rPr>
+        <w:t xml:space="preserve">project dissemination video can be found here: </w:t>
+      </w:r>
+      <w:hyperlink r:id="rId16" w:history="1">
+        <w:r>
+          <w:rPr>
+            <w:rStyle w:val="Hyperlink"/>
+            <w:rFonts w:ascii="Verdana" w:hAnsi="Verdana"/>
+            <w:sz w:val="18"/>
+            <w:szCs w:val="18"/>
+            <w:lang w:val="en-GB"/>
+          </w:rPr>
+          <w:t>https://youtu.be/A4xE48CfY-U</w:t>
+        </w:r>
+      </w:hyperlink>
+    </w:p>
+    <w:p>
+      <w:pPr>
+        <w:pStyle w:val="BodyText"/>
+        <w:rPr>
+          <w:rFonts w:ascii="Verdana" w:hAnsi="Verdana"/>
+          <w:sz w:val="18"/>
+          <w:szCs w:val="18"/>
+          <w:lang w:val="en-GB"/>
+        </w:rPr>
+      </w:pPr>
+      <w:r>
+        <w:rPr>
+          <w:rFonts w:ascii="Verdana" w:hAnsi="Verdana"/>
+          <w:sz w:val="18"/>
+          <w:szCs w:val="18"/>
+          <w:lang w:val="en-GB"/>
+        </w:rPr>
+        <w:t xml:space="preserve">The full project can also be found here: </w:t>
+      </w:r>
+      <w:hyperlink r:id="rId17" w:history="1">
+        <w:r>
+          <w:rPr>
+            <w:rStyle w:val="Hyperlink"/>
+            <w:rFonts w:ascii="Verdana" w:hAnsi="Verdana"/>
+            <w:sz w:val="18"/>
+            <w:szCs w:val="18"/>
+            <w:lang w:val="en-GB"/>
+          </w:rPr>
+          <w:t>https://uweacuk-my.sharepoint.com/:f:/g/personal/nichola</w:t>
         </w:r>
         <w:r>
           <w:rPr>
@@ -748,8 +820,9 @@
             <w:rFonts w:ascii="Verdana" w:hAnsi="Verdana"/>
             <w:sz w:val="18"/>
             <w:szCs w:val="18"/>
+            <w:lang w:val="en-GB"/>
           </w:rPr>
-          <w:t>b</w:t>
+          <w:t>s</w:t>
         </w:r>
         <w:r>
           <w:rPr>
@@ -757,38 +830,11 @@
             <w:rFonts w:ascii="Verdana" w:hAnsi="Verdana"/>
             <w:sz w:val="18"/>
             <w:szCs w:val="18"/>
+            <w:lang w:val="en-GB"/>
           </w:rPr>
-          <w:t>.com/heyitsnick4/CCTP</w:t>
+          <w:t>2_cornwell_live_uwe_ac_uk/EpyAnGSsauFKvuFyDwTZ98wBW99oaNiN-P1rWOccwCX9nA?e=VcFLHg</w:t>
         </w:r>
       </w:hyperlink>
-    </w:p>
-    <w:p>
-      <w:pPr>
-        <w:pStyle w:val="BodyText"/>
-        <w:rPr>
-          <w:rFonts w:ascii="Verdana" w:hAnsi="Verdana"/>
-          <w:sz w:val="18"/>
-          <w:szCs w:val="18"/>
-          <w:lang w:val="en-GB"/>
-        </w:rPr>
-      </w:pPr>
-      <w:r>
-        <w:rPr>
-          <w:rFonts w:ascii="Verdana" w:hAnsi="Verdana"/>
-          <w:sz w:val="18"/>
-          <w:szCs w:val="18"/>
-        </w:rPr>
-        <w:t xml:space="preserve">The video </w:t>
-      </w:r>
-      <w:r>
-        <w:rPr>
-          <w:rFonts w:ascii="Verdana" w:hAnsi="Verdana"/>
-          <w:sz w:val="18"/>
-          <w:szCs w:val="18"/>
-          <w:lang w:val="en-GB"/>
-        </w:rPr>
-        <w:t>project dissemination video can be found here: https://youtu.be/A4xE48CfY-U</w:t>
-      </w:r>
     </w:p>
     <w:p>
       <w:pPr>
@@ -811,10 +857,10 @@
           <w:szCs w:val="20"/>
         </w:rPr>
         <w:sectPr>
-          <w:headerReference w:type="even" r:id="rId16"/>
-          <w:headerReference w:type="default" r:id="rId17"/>
-          <w:footerReference w:type="default" r:id="rId18"/>
-          <w:headerReference w:type="first" r:id="rId19"/>
+          <w:headerReference w:type="even" r:id="rId18"/>
+          <w:headerReference w:type="default" r:id="rId19"/>
+          <w:footerReference w:type="default" r:id="rId20"/>
+          <w:headerReference w:type="first" r:id="rId21"/>
           <w:pgSz w:w="11900" w:h="16840"/>
           <w:pgMar w:top="1440" w:right="1080" w:bottom="1440" w:left="1080" w:header="708" w:footer="708" w:gutter="0"/>
           <w:cols w:space="708"/>
@@ -2270,7 +2316,16 @@
           <w:sz w:val="18"/>
           <w:szCs w:val="18"/>
         </w:rPr>
-        <w:t xml:space="preserve"> i</w:t>
+        <w:t xml:space="preserve"> </w:t>
+      </w:r>
+      <w:r>
+        <w:rPr>
+          <w:rFonts w:ascii="Verdana" w:hAnsi="Verdana"/>
+          <w:sz w:val="18"/>
+          <w:szCs w:val="18"/>
+        </w:rPr>
+        <w:lastRenderedPageBreak/>
+        <w:t>i</w:t>
       </w:r>
       <w:r>
         <w:rPr>
@@ -2384,16 +2439,7 @@
           <w:sz w:val="18"/>
           <w:szCs w:val="18"/>
         </w:rPr>
-        <w:t xml:space="preserve">. Visual learning is a method of learning where the information being portrayed is shown </w:t>
-      </w:r>
-      <w:r>
-        <w:rPr>
-          <w:rFonts w:ascii="Verdana" w:hAnsi="Verdana"/>
-          <w:sz w:val="18"/>
-          <w:szCs w:val="18"/>
-        </w:rPr>
-        <w:lastRenderedPageBreak/>
-        <w:t>using images or video.</w:t>
+        <w:t>. Visual learning is a method of learning where the information being portrayed is shown using images or video.</w:t>
       </w:r>
       <w:r>
         <w:rPr>
@@ -2611,7 +2657,15 @@
           <w:sz w:val="18"/>
           <w:szCs w:val="18"/>
         </w:rPr>
-        <w:t xml:space="preserve">(2022) found that an increase in immersion will keep people watching videos for longer. </w:t>
+        <w:t xml:space="preserve">(2022) found that an </w:t>
+      </w:r>
+      <w:r>
+        <w:rPr>
+          <w:rFonts w:ascii="Verdana" w:hAnsi="Verdana"/>
+          <w:sz w:val="18"/>
+          <w:szCs w:val="18"/>
+        </w:rPr>
+        <w:t xml:space="preserve">increase in immersion will keep people watching videos for longer. </w:t>
       </w:r>
       <w:r>
         <w:rPr>
@@ -3173,7 +3227,16 @@
           <w:sz w:val="18"/>
           <w:szCs w:val="18"/>
         </w:rPr>
-        <w:t xml:space="preserve"> Another paper by Sarah N and Brin G (2022) looked into how art-based kinaesthetic activities impacted college classrooms. The results amounted in a higher and more positive perception of the topic </w:t>
+        <w:t xml:space="preserve"> Another paper by Sarah N and Brin G (2022) looked into how art-based </w:t>
+      </w:r>
+      <w:r>
+        <w:rPr>
+          <w:rFonts w:ascii="Verdana" w:hAnsi="Verdana"/>
+          <w:sz w:val="18"/>
+          <w:szCs w:val="18"/>
+        </w:rPr>
+        <w:lastRenderedPageBreak/>
+        <w:t xml:space="preserve">kinaesthetic activities impacted college classrooms. The results amounted in a higher and more positive perception of the topic </w:t>
       </w:r>
       <w:r>
         <w:rPr>
@@ -3223,16 +3286,7 @@
           <w:sz w:val="18"/>
           <w:szCs w:val="18"/>
         </w:rPr>
-        <w:t xml:space="preserve"> by making them partake in the activity being taught to them letting them complete a challenge involving this learning type. Veli-Matti </w:t>
-      </w:r>
-      <w:r>
-        <w:rPr>
-          <w:rFonts w:ascii="Verdana" w:hAnsi="Verdana"/>
-          <w:sz w:val="18"/>
-          <w:szCs w:val="18"/>
-        </w:rPr>
-        <w:lastRenderedPageBreak/>
-        <w:t xml:space="preserve">Karhulahti (2013) mentions how “A pitfall is hidden in ‘kinesthetics’ too” with the physical actions of the player being half the learning experience as when coming into contact with a </w:t>
+        <w:t xml:space="preserve"> by making them partake in the activity being taught to them letting them complete a challenge involving this learning type. Veli-Matti Karhulahti (2013) mentions how “A pitfall is hidden in ‘kinesthetics’ too” with the physical actions of the player being half the learning experience as when coming into contact with a </w:t>
       </w:r>
       <w:r>
         <w:rPr>
@@ -3571,15 +3625,7 @@
           <w:sz w:val="18"/>
           <w:szCs w:val="18"/>
         </w:rPr>
-        <w:t xml:space="preserve">The fear of missing out (FOMO) is a method often used by developers to </w:t>
-      </w:r>
-      <w:r>
-        <w:rPr>
-          <w:rFonts w:ascii="Verdana" w:hAnsi="Verdana"/>
-          <w:sz w:val="18"/>
-          <w:szCs w:val="18"/>
-        </w:rPr>
-        <w:t xml:space="preserve">keep players coming back to their game and is a </w:t>
+        <w:t xml:space="preserve">The fear of missing out (FOMO) is a method often used by developers to keep players coming back to their game and is a </w:t>
       </w:r>
       <w:r>
         <w:rPr>
@@ -4012,7 +4058,16 @@
           <w:sz w:val="18"/>
           <w:szCs w:val="18"/>
         </w:rPr>
-        <w:t xml:space="preserve"> While not the most applicable, research into how to make people keep playing can be kept in mind when designing a game as someone who wants to keep going will want to learn more about the possible features the game presents. </w:t>
+        <w:t xml:space="preserve"> While not the most applicable, research into how to </w:t>
+      </w:r>
+      <w:r>
+        <w:rPr>
+          <w:rFonts w:ascii="Verdana" w:hAnsi="Verdana"/>
+          <w:sz w:val="18"/>
+          <w:szCs w:val="18"/>
+        </w:rPr>
+        <w:lastRenderedPageBreak/>
+        <w:t xml:space="preserve">make people keep playing can be kept in mind when designing a game as someone who wants to keep going will want to learn more about the possible features the game presents. </w:t>
       </w:r>
     </w:p>
     <w:p>
@@ -4121,16 +4176,7 @@
           <w:sz w:val="18"/>
           <w:szCs w:val="18"/>
         </w:rPr>
-        <w:t xml:space="preserve"> player testing. The review will go into topics such </w:t>
-      </w:r>
-      <w:r>
-        <w:rPr>
-          <w:rFonts w:ascii="Verdana" w:hAnsi="Verdana"/>
-          <w:sz w:val="18"/>
-          <w:szCs w:val="18"/>
-        </w:rPr>
-        <w:lastRenderedPageBreak/>
-        <w:t xml:space="preserve">as learning theory to find the most effective ways humans learn and pattern recognition and how this can be used to sub-consciously guide players. Looking deeper into how different ages learn will also help in making sure the new information provided is accessible and useful for a wider demographic. </w:t>
+        <w:t xml:space="preserve"> player testing. The review will go into topics such as learning theory to find the most effective ways humans learn and pattern recognition and how this can be used to sub-consciously guide players. Looking deeper into how different ages learn will also help in making sure the new information provided is accessible and useful for a wider demographic. </w:t>
       </w:r>
     </w:p>
     <w:p>
@@ -4794,7 +4840,7 @@
                         <a:effectLst/>
                         <a:extLst>
                           <a:ext uri="{C572A759-6A51-4108-AA02-DFA0A04FC94B}">
-                            <ma14:wrappingTextBoxFlag xmlns:ma14="http://schemas.microsoft.com/office/mac/drawingml/2011/main" xmlns:w="http://schemas.openxmlformats.org/wordprocessingml/2006/main" xmlns:w10="urn:schemas-microsoft-com:office:word" xmlns:v="urn:schemas-microsoft-com:vml" xmlns:o="urn:schemas-microsoft-com:office:office" xmlns:mv="urn:schemas-microsoft-com:mac:vml" xmlns:mo="http://schemas.microsoft.com/office/mac/office/2008/main" xmlns=""/>
+                            <ma14:wrappingTextBoxFlag xmlns="" xmlns:mo="http://schemas.microsoft.com/office/mac/office/2008/main" xmlns:mv="urn:schemas-microsoft-com:mac:vml" xmlns:o="urn:schemas-microsoft-com:office:office" xmlns:v="urn:schemas-microsoft-com:vml" xmlns:w10="urn:schemas-microsoft-com:office:word" xmlns:w="http://schemas.openxmlformats.org/wordprocessingml/2006/main" xmlns:ma14="http://schemas.microsoft.com/office/mac/drawingml/2011/main"/>
                           </a:ext>
                         </a:extLst>
                       </wps:spPr>
@@ -4838,7 +4884,7 @@
                                           <pic:cNvPicPr/>
                                         </pic:nvPicPr>
                                         <pic:blipFill>
-                                          <a:blip r:embed="rId20"/>
+                                          <a:blip r:embed="rId22"/>
                                           <a:stretch>
                                             <a:fillRect/>
                                           </a:stretch>
@@ -4902,7 +4948,7 @@
                                     <pic:cNvPicPr/>
                                   </pic:nvPicPr>
                                   <pic:blipFill>
-                                    <a:blip r:embed="rId20"/>
+                                    <a:blip r:embed="rId22"/>
                                     <a:stretch>
                                       <a:fillRect/>
                                     </a:stretch>
@@ -5151,7 +5197,17 @@
           <w:sz w:val="18"/>
           <w:szCs w:val="18"/>
         </w:rPr>
-        <w:t xml:space="preserve">movement. The player is given the option to dash in 8 different </w:t>
+        <w:t xml:space="preserve">movement. The player is given the option to dash </w:t>
+      </w:r>
+      <w:r>
+        <w:rPr>
+          <w:rFonts w:ascii="Verdana" w:hAnsi="Verdana"/>
+          <w:noProof/>
+          <w:sz w:val="18"/>
+          <w:szCs w:val="18"/>
+        </w:rPr>
+        <w:lastRenderedPageBreak/>
+        <w:t xml:space="preserve">in 8 different </w:t>
       </w:r>
       <w:r>
         <w:rPr>
@@ -5273,7 +5329,6 @@
           <w:sz w:val="18"/>
           <w:szCs w:val="18"/>
         </w:rPr>
-        <w:lastRenderedPageBreak/>
         <w:t xml:space="preserve">Many 2D side scrolling games have a wall jump and slide mechanic such as the </w:t>
       </w:r>
       <w:r>
@@ -5484,7 +5539,7 @@
                         <a:effectLst/>
                         <a:extLst>
                           <a:ext uri="{C572A759-6A51-4108-AA02-DFA0A04FC94B}">
-                            <ma14:wrappingTextBoxFlag xmlns:ma14="http://schemas.microsoft.com/office/mac/drawingml/2011/main" xmlns:w="http://schemas.openxmlformats.org/wordprocessingml/2006/main" xmlns:w10="urn:schemas-microsoft-com:office:word" xmlns:v="urn:schemas-microsoft-com:vml" xmlns:o="urn:schemas-microsoft-com:office:office" xmlns:mv="urn:schemas-microsoft-com:mac:vml" xmlns:mo="http://schemas.microsoft.com/office/mac/office/2008/main" xmlns=""/>
+                            <ma14:wrappingTextBoxFlag xmlns="" xmlns:mo="http://schemas.microsoft.com/office/mac/office/2008/main" xmlns:mv="urn:schemas-microsoft-com:mac:vml" xmlns:o="urn:schemas-microsoft-com:office:office" xmlns:v="urn:schemas-microsoft-com:vml" xmlns:w10="urn:schemas-microsoft-com:office:word" xmlns:w="http://schemas.openxmlformats.org/wordprocessingml/2006/main" xmlns:ma14="http://schemas.microsoft.com/office/mac/drawingml/2011/main"/>
                           </a:ext>
                         </a:extLst>
                       </wps:spPr>
@@ -5528,7 +5583,7 @@
                                           <pic:cNvPicPr/>
                                         </pic:nvPicPr>
                                         <pic:blipFill>
-                                          <a:blip r:embed="rId21"/>
+                                          <a:blip r:embed="rId23"/>
                                           <a:stretch>
                                             <a:fillRect/>
                                           </a:stretch>
@@ -5592,7 +5647,7 @@
                                     <pic:cNvPicPr/>
                                   </pic:nvPicPr>
                                   <pic:blipFill>
-                                    <a:blip r:embed="rId21"/>
+                                    <a:blip r:embed="rId23"/>
                                     <a:stretch>
                                       <a:fillRect/>
                                     </a:stretch>
@@ -5830,7 +5885,7 @@
                         <a:effectLst/>
                         <a:extLst>
                           <a:ext uri="{C572A759-6A51-4108-AA02-DFA0A04FC94B}">
-                            <ma14:wrappingTextBoxFlag xmlns:ma14="http://schemas.microsoft.com/office/mac/drawingml/2011/main" xmlns:w="http://schemas.openxmlformats.org/wordprocessingml/2006/main" xmlns:w10="urn:schemas-microsoft-com:office:word" xmlns:v="urn:schemas-microsoft-com:vml" xmlns:o="urn:schemas-microsoft-com:office:office" xmlns:mv="urn:schemas-microsoft-com:mac:vml" xmlns:mo="http://schemas.microsoft.com/office/mac/office/2008/main" xmlns=""/>
+                            <ma14:wrappingTextBoxFlag xmlns="" xmlns:mo="http://schemas.microsoft.com/office/mac/office/2008/main" xmlns:mv="urn:schemas-microsoft-com:mac:vml" xmlns:o="urn:schemas-microsoft-com:office:office" xmlns:v="urn:schemas-microsoft-com:vml" xmlns:w10="urn:schemas-microsoft-com:office:word" xmlns:w="http://schemas.openxmlformats.org/wordprocessingml/2006/main" xmlns:ma14="http://schemas.microsoft.com/office/mac/drawingml/2011/main"/>
                           </a:ext>
                         </a:extLst>
                       </wps:spPr>
@@ -5874,7 +5929,7 @@
                                           <pic:cNvPicPr/>
                                         </pic:nvPicPr>
                                         <pic:blipFill>
-                                          <a:blip r:embed="rId22"/>
+                                          <a:blip r:embed="rId24"/>
                                           <a:stretch>
                                             <a:fillRect/>
                                           </a:stretch>
@@ -5938,7 +5993,7 @@
                                     <pic:cNvPicPr/>
                                   </pic:nvPicPr>
                                   <pic:blipFill>
-                                    <a:blip r:embed="rId22"/>
+                                    <a:blip r:embed="rId24"/>
                                     <a:stretch>
                                       <a:fillRect/>
                                     </a:stretch>
@@ -6097,15 +6152,7 @@
           <w:sz w:val="18"/>
           <w:szCs w:val="18"/>
         </w:rPr>
-        <w:t xml:space="preserve">A Rigidbody 2D (Unity Technologies, 2024) component is attached to give physics such as gravity to the player as well as any physics-based behaviour like drag and mass. Finally, a C# script was attached which will control all the movement logic for the player which will be looked at deeper in the next section. These components </w:t>
-      </w:r>
-      <w:r>
-        <w:rPr>
-          <w:rFonts w:ascii="Verdana" w:hAnsi="Verdana"/>
-          <w:sz w:val="18"/>
-          <w:szCs w:val="18"/>
-        </w:rPr>
-        <w:t xml:space="preserve">are essential to creating simple player movement and provide all the tools to add extra movement abilities. Figure 4 shows the </w:t>
+        <w:t xml:space="preserve">A Rigidbody 2D (Unity Technologies, 2024) component is attached to give physics such as gravity to the player as well as any physics-based behaviour like drag and mass. Finally, a C# script was attached which will control all the movement logic for the player which will be looked at deeper in the next section. These components are essential to creating simple player movement and provide all the tools to add extra movement abilities. Figure 4 shows the </w:t>
       </w:r>
       <w:r>
         <w:rPr>
@@ -6182,7 +6229,7 @@
                         <a:effectLst/>
                         <a:extLst>
                           <a:ext uri="{C572A759-6A51-4108-AA02-DFA0A04FC94B}">
-                            <ma14:wrappingTextBoxFlag xmlns:ma14="http://schemas.microsoft.com/office/mac/drawingml/2011/main" xmlns:w="http://schemas.openxmlformats.org/wordprocessingml/2006/main" xmlns:w10="urn:schemas-microsoft-com:office:word" xmlns:v="urn:schemas-microsoft-com:vml" xmlns:o="urn:schemas-microsoft-com:office:office" xmlns:mv="urn:schemas-microsoft-com:mac:vml" xmlns:mo="http://schemas.microsoft.com/office/mac/office/2008/main" xmlns=""/>
+                            <ma14:wrappingTextBoxFlag xmlns="" xmlns:mo="http://schemas.microsoft.com/office/mac/office/2008/main" xmlns:mv="urn:schemas-microsoft-com:mac:vml" xmlns:o="urn:schemas-microsoft-com:office:office" xmlns:v="urn:schemas-microsoft-com:vml" xmlns:w10="urn:schemas-microsoft-com:office:word" xmlns:w="http://schemas.openxmlformats.org/wordprocessingml/2006/main" xmlns:ma14="http://schemas.microsoft.com/office/mac/drawingml/2011/main"/>
                           </a:ext>
                         </a:extLst>
                       </wps:spPr>
@@ -6226,7 +6273,7 @@
                                           <pic:cNvPicPr/>
                                         </pic:nvPicPr>
                                         <pic:blipFill>
-                                          <a:blip r:embed="rId23"/>
+                                          <a:blip r:embed="rId25"/>
                                           <a:stretch>
                                             <a:fillRect/>
                                           </a:stretch>
@@ -6290,7 +6337,7 @@
                                     <pic:cNvPicPr/>
                                   </pic:nvPicPr>
                                   <pic:blipFill>
-                                    <a:blip r:embed="rId23"/>
+                                    <a:blip r:embed="rId25"/>
                                     <a:stretch>
                                       <a:fillRect/>
                                     </a:stretch>
@@ -6561,7 +6608,7 @@
           <w:sz w:val="18"/>
           <w:szCs w:val="18"/>
         </w:rPr>
-        <w:t xml:space="preserve"> which gives a float between -1 and 1. There are a variety of different methods for moving the player character however the decision for this project was to use the Ri</w:t>
+        <w:t xml:space="preserve"> which gives a float between -1 and 1. There are a variety of different methods for moving the player character however the decision </w:t>
       </w:r>
       <w:r>
         <w:rPr>
@@ -6571,6 +6618,17 @@
           <w:sz w:val="18"/>
           <w:szCs w:val="18"/>
         </w:rPr>
+        <w:lastRenderedPageBreak/>
+        <w:t>for this project was to use the Ri</w:t>
+      </w:r>
+      <w:r>
+        <w:rPr>
+          <w:rFonts w:ascii="Verdana" w:hAnsi="Verdana"/>
+          <w:bCs/>
+          <w:noProof/>
+          <w:sz w:val="18"/>
+          <w:szCs w:val="18"/>
+        </w:rPr>
         <w:t>gid</w:t>
       </w:r>
       <w:r>
@@ -6726,7 +6784,6 @@
           <w:sz w:val="18"/>
           <w:szCs w:val="18"/>
         </w:rPr>
-        <w:lastRenderedPageBreak/>
         <w:t>rb.velocity</w:t>
       </w:r>
       <w:proofErr w:type="spellEnd"/>
@@ -6973,7 +7030,7 @@
                         <a:effectLst/>
                         <a:extLst>
                           <a:ext uri="{C572A759-6A51-4108-AA02-DFA0A04FC94B}">
-                            <ma14:wrappingTextBoxFlag xmlns:ma14="http://schemas.microsoft.com/office/mac/drawingml/2011/main" xmlns:w="http://schemas.openxmlformats.org/wordprocessingml/2006/main" xmlns:w10="urn:schemas-microsoft-com:office:word" xmlns:v="urn:schemas-microsoft-com:vml" xmlns:o="urn:schemas-microsoft-com:office:office" xmlns:mv="urn:schemas-microsoft-com:mac:vml" xmlns:mo="http://schemas.microsoft.com/office/mac/office/2008/main" xmlns=""/>
+                            <ma14:wrappingTextBoxFlag xmlns="" xmlns:mo="http://schemas.microsoft.com/office/mac/office/2008/main" xmlns:mv="urn:schemas-microsoft-com:mac:vml" xmlns:o="urn:schemas-microsoft-com:office:office" xmlns:v="urn:schemas-microsoft-com:vml" xmlns:w10="urn:schemas-microsoft-com:office:word" xmlns:w="http://schemas.openxmlformats.org/wordprocessingml/2006/main" xmlns:ma14="http://schemas.microsoft.com/office/mac/drawingml/2011/main"/>
                           </a:ext>
                         </a:extLst>
                       </wps:spPr>
@@ -7017,7 +7074,7 @@
                                           <pic:cNvPicPr/>
                                         </pic:nvPicPr>
                                         <pic:blipFill>
-                                          <a:blip r:embed="rId24"/>
+                                          <a:blip r:embed="rId26"/>
                                           <a:stretch>
                                             <a:fillRect/>
                                           </a:stretch>
@@ -7081,7 +7138,7 @@
                                     <pic:cNvPicPr/>
                                   </pic:nvPicPr>
                                   <pic:blipFill>
-                                    <a:blip r:embed="rId24"/>
+                                    <a:blip r:embed="rId26"/>
                                     <a:stretch>
                                       <a:fillRect/>
                                     </a:stretch>
@@ -7212,15 +7269,7 @@
           <w:sz w:val="18"/>
           <w:szCs w:val="18"/>
         </w:rPr>
-        <w:t xml:space="preserve">point was an empty object above the player solving the issue of most of the camera being full of dead space. This way of moving the camera was used until the level </w:t>
-      </w:r>
-      <w:r>
-        <w:rPr>
-          <w:rFonts w:ascii="Verdana" w:hAnsi="Verdana"/>
-          <w:sz w:val="18"/>
-          <w:szCs w:val="18"/>
-        </w:rPr>
-        <w:t xml:space="preserve">design changed from having one continuous level to multiple areas connected. The decision was made to have the camera static due to the new level designs and when the player enters a new zone the camera moves to the new point. During the last level there was a vertical section which meant that moving the camera from one point to another could be quite jarring to the player due to the rapid jumps between </w:t>
+        <w:t xml:space="preserve">point was an empty object above the player solving the issue of most of the camera being full of dead space. This way of moving the camera was used until the level design changed from having one continuous level to multiple areas connected. The decision was made to have the camera static due to the new level designs and when the player enters a new zone the camera moves to the new point. During the last level there was a vertical section which meant that moving the camera from one point to another could be quite jarring to the player due to the rapid jumps between </w:t>
       </w:r>
       <w:r>
         <w:rPr>
@@ -7417,7 +7466,7 @@
                         <a:effectLst/>
                         <a:extLst>
                           <a:ext uri="{C572A759-6A51-4108-AA02-DFA0A04FC94B}">
-                            <ma14:wrappingTextBoxFlag xmlns:ma14="http://schemas.microsoft.com/office/mac/drawingml/2011/main" xmlns:w="http://schemas.openxmlformats.org/wordprocessingml/2006/main" xmlns:w10="urn:schemas-microsoft-com:office:word" xmlns:v="urn:schemas-microsoft-com:vml" xmlns:o="urn:schemas-microsoft-com:office:office" xmlns:mv="urn:schemas-microsoft-com:mac:vml" xmlns:mo="http://schemas.microsoft.com/office/mac/office/2008/main" xmlns=""/>
+                            <ma14:wrappingTextBoxFlag xmlns="" xmlns:mo="http://schemas.microsoft.com/office/mac/office/2008/main" xmlns:mv="urn:schemas-microsoft-com:mac:vml" xmlns:o="urn:schemas-microsoft-com:office:office" xmlns:v="urn:schemas-microsoft-com:vml" xmlns:w10="urn:schemas-microsoft-com:office:word" xmlns:w="http://schemas.openxmlformats.org/wordprocessingml/2006/main" xmlns:ma14="http://schemas.microsoft.com/office/mac/drawingml/2011/main"/>
                           </a:ext>
                         </a:extLst>
                       </wps:spPr>
@@ -7461,7 +7510,7 @@
                                           <pic:cNvPicPr/>
                                         </pic:nvPicPr>
                                         <pic:blipFill>
-                                          <a:blip r:embed="rId25"/>
+                                          <a:blip r:embed="rId27"/>
                                           <a:stretch>
                                             <a:fillRect/>
                                           </a:stretch>
@@ -7525,7 +7574,7 @@
                                     <pic:cNvPicPr/>
                                   </pic:nvPicPr>
                                   <pic:blipFill>
-                                    <a:blip r:embed="rId25"/>
+                                    <a:blip r:embed="rId27"/>
                                     <a:stretch>
                                       <a:fillRect/>
                                     </a:stretch>
@@ -7855,7 +7904,16 @@
           <w:sz w:val="18"/>
           <w:szCs w:val="18"/>
         </w:rPr>
-        <w:t xml:space="preserve"> surface when given the correct layer. The </w:t>
+        <w:t xml:space="preserve"> surface when </w:t>
+      </w:r>
+      <w:r>
+        <w:rPr>
+          <w:rFonts w:ascii="Verdana" w:hAnsi="Verdana"/>
+          <w:sz w:val="18"/>
+          <w:szCs w:val="18"/>
+        </w:rPr>
+        <w:lastRenderedPageBreak/>
+        <w:t xml:space="preserve">given the correct layer. The </w:t>
       </w:r>
       <w:r>
         <w:rPr>
@@ -7953,16 +8011,7 @@
           <w:sz w:val="18"/>
           <w:szCs w:val="18"/>
         </w:rPr>
-        <w:t xml:space="preserve"> checks for if a </w:t>
-      </w:r>
-      <w:r>
-        <w:rPr>
-          <w:rFonts w:ascii="Verdana" w:hAnsi="Verdana"/>
-          <w:sz w:val="18"/>
-          <w:szCs w:val="18"/>
-        </w:rPr>
-        <w:lastRenderedPageBreak/>
-        <w:t xml:space="preserve">player is connected to a wall. The </w:t>
+        <w:t xml:space="preserve"> checks for if a player is connected to a wall. The </w:t>
       </w:r>
       <w:r>
         <w:rPr>
@@ -8248,7 +8297,15 @@
           <w:sz w:val="18"/>
           <w:szCs w:val="18"/>
         </w:rPr>
-        <w:t xml:space="preserve"> Bros (Nintendo EAD, 2006) due to its popularity as mentioned in section 5.1. </w:t>
+        <w:t xml:space="preserve"> Bros (Nintendo EAD, 2006) due to its popularity </w:t>
+      </w:r>
+      <w:r>
+        <w:rPr>
+          <w:rFonts w:ascii="Verdana" w:hAnsi="Verdana"/>
+          <w:sz w:val="18"/>
+          <w:szCs w:val="18"/>
+        </w:rPr>
+        <w:t xml:space="preserve">as mentioned in section 5.1. </w:t>
       </w:r>
       <w:r>
         <w:rPr>
@@ -8319,7 +8376,7 @@
                         <a:effectLst/>
                         <a:extLst>
                           <a:ext uri="{C572A759-6A51-4108-AA02-DFA0A04FC94B}">
-                            <ma14:wrappingTextBoxFlag xmlns:ma14="http://schemas.microsoft.com/office/mac/drawingml/2011/main" xmlns:w="http://schemas.openxmlformats.org/wordprocessingml/2006/main" xmlns:w10="urn:schemas-microsoft-com:office:word" xmlns:v="urn:schemas-microsoft-com:vml" xmlns:o="urn:schemas-microsoft-com:office:office" xmlns:mv="urn:schemas-microsoft-com:mac:vml" xmlns:mo="http://schemas.microsoft.com/office/mac/office/2008/main" xmlns=""/>
+                            <ma14:wrappingTextBoxFlag xmlns="" xmlns:mo="http://schemas.microsoft.com/office/mac/office/2008/main" xmlns:mv="urn:schemas-microsoft-com:mac:vml" xmlns:o="urn:schemas-microsoft-com:office:office" xmlns:v="urn:schemas-microsoft-com:vml" xmlns:w10="urn:schemas-microsoft-com:office:word" xmlns:w="http://schemas.openxmlformats.org/wordprocessingml/2006/main" xmlns:ma14="http://schemas.microsoft.com/office/mac/drawingml/2011/main"/>
                           </a:ext>
                         </a:extLst>
                       </wps:spPr>
@@ -8363,7 +8420,7 @@
                                           <pic:cNvPicPr/>
                                         </pic:nvPicPr>
                                         <pic:blipFill>
-                                          <a:blip r:embed="rId26"/>
+                                          <a:blip r:embed="rId28"/>
                                           <a:stretch>
                                             <a:fillRect/>
                                           </a:stretch>
@@ -8427,7 +8484,7 @@
                                     <pic:cNvPicPr/>
                                   </pic:nvPicPr>
                                   <pic:blipFill>
-                                    <a:blip r:embed="rId26"/>
+                                    <a:blip r:embed="rId28"/>
                                     <a:stretch>
                                       <a:fillRect/>
                                     </a:stretch>
@@ -8795,7 +8852,7 @@
                         <a:effectLst/>
                         <a:extLst>
                           <a:ext uri="{C572A759-6A51-4108-AA02-DFA0A04FC94B}">
-                            <ma14:wrappingTextBoxFlag xmlns:ma14="http://schemas.microsoft.com/office/mac/drawingml/2011/main" xmlns:w="http://schemas.openxmlformats.org/wordprocessingml/2006/main" xmlns:w10="urn:schemas-microsoft-com:office:word" xmlns:v="urn:schemas-microsoft-com:vml" xmlns:o="urn:schemas-microsoft-com:office:office" xmlns:mv="urn:schemas-microsoft-com:mac:vml" xmlns:mo="http://schemas.microsoft.com/office/mac/office/2008/main" xmlns=""/>
+                            <ma14:wrappingTextBoxFlag xmlns="" xmlns:mo="http://schemas.microsoft.com/office/mac/office/2008/main" xmlns:mv="urn:schemas-microsoft-com:mac:vml" xmlns:o="urn:schemas-microsoft-com:office:office" xmlns:v="urn:schemas-microsoft-com:vml" xmlns:w10="urn:schemas-microsoft-com:office:word" xmlns:w="http://schemas.openxmlformats.org/wordprocessingml/2006/main" xmlns:ma14="http://schemas.microsoft.com/office/mac/drawingml/2011/main"/>
                           </a:ext>
                         </a:extLst>
                       </wps:spPr>
@@ -8839,7 +8896,7 @@
                                           <pic:cNvPicPr/>
                                         </pic:nvPicPr>
                                         <pic:blipFill>
-                                          <a:blip r:embed="rId27"/>
+                                          <a:blip r:embed="rId29"/>
                                           <a:stretch>
                                             <a:fillRect/>
                                           </a:stretch>
@@ -8903,7 +8960,7 @@
                                     <pic:cNvPicPr/>
                                   </pic:nvPicPr>
                                   <pic:blipFill>
-                                    <a:blip r:embed="rId27"/>
+                                    <a:blip r:embed="rId29"/>
                                     <a:stretch>
                                       <a:fillRect/>
                                     </a:stretch>
@@ -9109,7 +9166,7 @@
                         <a:effectLst/>
                         <a:extLst>
                           <a:ext uri="{C572A759-6A51-4108-AA02-DFA0A04FC94B}">
-                            <ma14:wrappingTextBoxFlag xmlns:ma14="http://schemas.microsoft.com/office/mac/drawingml/2011/main" xmlns:w="http://schemas.openxmlformats.org/wordprocessingml/2006/main" xmlns:w10="urn:schemas-microsoft-com:office:word" xmlns:v="urn:schemas-microsoft-com:vml" xmlns:o="urn:schemas-microsoft-com:office:office" xmlns:mv="urn:schemas-microsoft-com:mac:vml" xmlns:mo="http://schemas.microsoft.com/office/mac/office/2008/main" xmlns=""/>
+                            <ma14:wrappingTextBoxFlag xmlns="" xmlns:mo="http://schemas.microsoft.com/office/mac/office/2008/main" xmlns:mv="urn:schemas-microsoft-com:mac:vml" xmlns:o="urn:schemas-microsoft-com:office:office" xmlns:v="urn:schemas-microsoft-com:vml" xmlns:w10="urn:schemas-microsoft-com:office:word" xmlns:w="http://schemas.openxmlformats.org/wordprocessingml/2006/main" xmlns:ma14="http://schemas.microsoft.com/office/mac/drawingml/2011/main"/>
                           </a:ext>
                         </a:extLst>
                       </wps:spPr>
@@ -9153,7 +9210,7 @@
                                           <pic:cNvPicPr/>
                                         </pic:nvPicPr>
                                         <pic:blipFill>
-                                          <a:blip r:embed="rId28"/>
+                                          <a:blip r:embed="rId30"/>
                                           <a:stretch>
                                             <a:fillRect/>
                                           </a:stretch>
@@ -9217,7 +9274,7 @@
                                     <pic:cNvPicPr/>
                                   </pic:nvPicPr>
                                   <pic:blipFill>
-                                    <a:blip r:embed="rId28"/>
+                                    <a:blip r:embed="rId30"/>
                                     <a:stretch>
                                       <a:fillRect/>
                                     </a:stretch>
@@ -9497,7 +9554,7 @@
                         <a:effectLst/>
                         <a:extLst>
                           <a:ext uri="{C572A759-6A51-4108-AA02-DFA0A04FC94B}">
-                            <ma14:wrappingTextBoxFlag xmlns:ma14="http://schemas.microsoft.com/office/mac/drawingml/2011/main" xmlns:w="http://schemas.openxmlformats.org/wordprocessingml/2006/main" xmlns:w10="urn:schemas-microsoft-com:office:word" xmlns:v="urn:schemas-microsoft-com:vml" xmlns:o="urn:schemas-microsoft-com:office:office" xmlns:mv="urn:schemas-microsoft-com:mac:vml" xmlns:mo="http://schemas.microsoft.com/office/mac/office/2008/main" xmlns=""/>
+                            <ma14:wrappingTextBoxFlag xmlns="" xmlns:mo="http://schemas.microsoft.com/office/mac/office/2008/main" xmlns:mv="urn:schemas-microsoft-com:mac:vml" xmlns:o="urn:schemas-microsoft-com:office:office" xmlns:v="urn:schemas-microsoft-com:vml" xmlns:w10="urn:schemas-microsoft-com:office:word" xmlns:w="http://schemas.openxmlformats.org/wordprocessingml/2006/main" xmlns:ma14="http://schemas.microsoft.com/office/mac/drawingml/2011/main"/>
                           </a:ext>
                         </a:extLst>
                       </wps:spPr>
@@ -9541,7 +9598,7 @@
                                           <pic:cNvPicPr/>
                                         </pic:nvPicPr>
                                         <pic:blipFill>
-                                          <a:blip r:embed="rId29"/>
+                                          <a:blip r:embed="rId31"/>
                                           <a:stretch>
                                             <a:fillRect/>
                                           </a:stretch>
@@ -9611,7 +9668,7 @@
                                     <pic:cNvPicPr/>
                                   </pic:nvPicPr>
                                   <pic:blipFill>
-                                    <a:blip r:embed="rId29"/>
+                                    <a:blip r:embed="rId31"/>
                                     <a:stretch>
                                       <a:fillRect/>
                                     </a:stretch>
@@ -9770,7 +9827,7 @@
                         <a:effectLst/>
                         <a:extLst>
                           <a:ext uri="{C572A759-6A51-4108-AA02-DFA0A04FC94B}">
-                            <ma14:wrappingTextBoxFlag xmlns:ma14="http://schemas.microsoft.com/office/mac/drawingml/2011/main" xmlns:w="http://schemas.openxmlformats.org/wordprocessingml/2006/main" xmlns:w10="urn:schemas-microsoft-com:office:word" xmlns:v="urn:schemas-microsoft-com:vml" xmlns:o="urn:schemas-microsoft-com:office:office" xmlns:mv="urn:schemas-microsoft-com:mac:vml" xmlns:mo="http://schemas.microsoft.com/office/mac/office/2008/main" xmlns=""/>
+                            <ma14:wrappingTextBoxFlag xmlns="" xmlns:mo="http://schemas.microsoft.com/office/mac/office/2008/main" xmlns:mv="urn:schemas-microsoft-com:mac:vml" xmlns:o="urn:schemas-microsoft-com:office:office" xmlns:v="urn:schemas-microsoft-com:vml" xmlns:w10="urn:schemas-microsoft-com:office:word" xmlns:w="http://schemas.openxmlformats.org/wordprocessingml/2006/main" xmlns:ma14="http://schemas.microsoft.com/office/mac/drawingml/2011/main"/>
                           </a:ext>
                         </a:extLst>
                       </wps:spPr>
@@ -9814,7 +9871,7 @@
                                           <pic:cNvPicPr/>
                                         </pic:nvPicPr>
                                         <pic:blipFill>
-                                          <a:blip r:embed="rId30"/>
+                                          <a:blip r:embed="rId32"/>
                                           <a:stretch>
                                             <a:fillRect/>
                                           </a:stretch>
@@ -9878,7 +9935,7 @@
                                     <pic:cNvPicPr/>
                                   </pic:nvPicPr>
                                   <pic:blipFill>
-                                    <a:blip r:embed="rId30"/>
+                                    <a:blip r:embed="rId32"/>
                                     <a:stretch>
                                       <a:fillRect/>
                                     </a:stretch>
@@ -11293,7 +11350,7 @@
         </w:rPr>
         <w:t xml:space="preserve"> Available from: </w:t>
       </w:r>
-      <w:hyperlink r:id="rId31" w:tgtFrame="_new" w:history="1">
+      <w:hyperlink r:id="rId33" w:tgtFrame="_new" w:history="1">
         <w:r>
           <w:rPr>
             <w:rStyle w:val="Hyperlink"/>
@@ -11363,7 +11420,7 @@
         </w:rPr>
         <w:t xml:space="preserve"> Available from: </w:t>
       </w:r>
-      <w:hyperlink r:id="rId32" w:anchor=":~:text=In%20the%20general%20population%2C%20the,%25%20auditory%20and%205%25%20kinesthetic" w:tgtFrame="_new" w:history="1">
+      <w:hyperlink r:id="rId34" w:anchor=":~:text=In%20the%20general%20population%2C%20the,%25%20auditory%20and%205%25%20kinesthetic" w:tgtFrame="_new" w:history="1">
         <w:r>
           <w:rPr>
             <w:rStyle w:val="Hyperlink"/>
@@ -11433,7 +11490,7 @@
         </w:rPr>
         <w:t xml:space="preserve"> Available from: </w:t>
       </w:r>
-      <w:hyperlink r:id="rId33" w:tgtFrame="_new" w:history="1">
+      <w:hyperlink r:id="rId35" w:tgtFrame="_new" w:history="1">
         <w:r>
           <w:rPr>
             <w:rStyle w:val="Hyperlink"/>
@@ -11503,7 +11560,7 @@
         </w:rPr>
         <w:t xml:space="preserve"> Available from: </w:t>
       </w:r>
-      <w:hyperlink r:id="rId34" w:anchor="core-collateral-self-citation" w:tgtFrame="_new" w:history="1">
+      <w:hyperlink r:id="rId36" w:anchor="core-collateral-self-citation" w:tgtFrame="_new" w:history="1">
         <w:r>
           <w:rPr>
             <w:rStyle w:val="Hyperlink"/>
@@ -11573,7 +11630,7 @@
         </w:rPr>
         <w:t xml:space="preserve"> Available from: </w:t>
       </w:r>
-      <w:hyperlink r:id="rId35" w:tgtFrame="_new" w:history="1">
+      <w:hyperlink r:id="rId37" w:tgtFrame="_new" w:history="1">
         <w:r>
           <w:rPr>
             <w:rStyle w:val="Hyperlink"/>
@@ -11643,7 +11700,7 @@
         </w:rPr>
         <w:t xml:space="preserve"> Available from: </w:t>
       </w:r>
-      <w:hyperlink r:id="rId36" w:tgtFrame="_new" w:history="1">
+      <w:hyperlink r:id="rId38" w:tgtFrame="_new" w:history="1">
         <w:r>
           <w:rPr>
             <w:rStyle w:val="Hyperlink"/>
@@ -11713,7 +11770,7 @@
         </w:rPr>
         <w:t xml:space="preserve"> Available from: </w:t>
       </w:r>
-      <w:hyperlink r:id="rId37" w:tgtFrame="_new" w:history="1">
+      <w:hyperlink r:id="rId39" w:tgtFrame="_new" w:history="1">
         <w:r>
           <w:rPr>
             <w:rStyle w:val="Hyperlink"/>
@@ -11783,7 +11840,7 @@
         </w:rPr>
         <w:t xml:space="preserve"> Available from: </w:t>
       </w:r>
-      <w:hyperlink r:id="rId38" w:tgtFrame="_new" w:history="1">
+      <w:hyperlink r:id="rId40" w:tgtFrame="_new" w:history="1">
         <w:r>
           <w:rPr>
             <w:rStyle w:val="Hyperlink"/>
@@ -11864,7 +11921,7 @@
         </w:rPr>
         <w:t xml:space="preserve"> Available from: </w:t>
       </w:r>
-      <w:hyperlink r:id="rId39" w:tgtFrame="_new" w:history="1">
+      <w:hyperlink r:id="rId41" w:tgtFrame="_new" w:history="1">
         <w:r>
           <w:rPr>
             <w:rStyle w:val="Hyperlink"/>
@@ -11934,7 +11991,7 @@
         </w:rPr>
         <w:t xml:space="preserve"> Available from: </w:t>
       </w:r>
-      <w:hyperlink r:id="rId40" w:tgtFrame="_new" w:history="1">
+      <w:hyperlink r:id="rId42" w:tgtFrame="_new" w:history="1">
         <w:r>
           <w:rPr>
             <w:rStyle w:val="Hyperlink"/>
@@ -12004,7 +12061,7 @@
         </w:rPr>
         <w:t xml:space="preserve"> Available from: </w:t>
       </w:r>
-      <w:hyperlink r:id="rId41" w:anchor=":~:text=Only%205%25%20of%20respondents%20stated,when%20attempting%20to%20retain%20information" w:tgtFrame="_new" w:history="1">
+      <w:hyperlink r:id="rId43" w:anchor=":~:text=Only%205%25%20of%20respondents%20stated,when%20attempting%20to%20retain%20information" w:tgtFrame="_new" w:history="1">
         <w:r>
           <w:rPr>
             <w:rStyle w:val="Hyperlink"/>
@@ -12074,7 +12131,7 @@
         </w:rPr>
         <w:t xml:space="preserve"> Available from: </w:t>
       </w:r>
-      <w:hyperlink r:id="rId42" w:tgtFrame="_new" w:history="1">
+      <w:hyperlink r:id="rId44" w:tgtFrame="_new" w:history="1">
         <w:r>
           <w:rPr>
             <w:rStyle w:val="Hyperlink"/>
@@ -12183,7 +12240,7 @@
         </w:rPr>
         <w:t xml:space="preserve"> Available from: </w:t>
       </w:r>
-      <w:hyperlink r:id="rId43" w:tgtFrame="_new" w:history="1">
+      <w:hyperlink r:id="rId45" w:tgtFrame="_new" w:history="1">
         <w:r>
           <w:rPr>
             <w:rStyle w:val="Hyperlink"/>
@@ -12253,7 +12310,7 @@
         </w:rPr>
         <w:t xml:space="preserve"> Available from: </w:t>
       </w:r>
-      <w:hyperlink r:id="rId44" w:anchor="Abs1" w:tgtFrame="_new" w:history="1">
+      <w:hyperlink r:id="rId46" w:anchor="Abs1" w:tgtFrame="_new" w:history="1">
         <w:r>
           <w:rPr>
             <w:rStyle w:val="Hyperlink"/>
@@ -12323,7 +12380,7 @@
         </w:rPr>
         <w:t xml:space="preserve"> Available from: </w:t>
       </w:r>
-      <w:hyperlink r:id="rId45" w:tgtFrame="_new" w:history="1">
+      <w:hyperlink r:id="rId47" w:tgtFrame="_new" w:history="1">
         <w:r>
           <w:rPr>
             <w:rStyle w:val="Hyperlink"/>
@@ -12393,7 +12450,7 @@
         </w:rPr>
         <w:t xml:space="preserve"> Available from: </w:t>
       </w:r>
-      <w:hyperlink r:id="rId46" w:tgtFrame="_new" w:history="1">
+      <w:hyperlink r:id="rId48" w:tgtFrame="_new" w:history="1">
         <w:r>
           <w:rPr>
             <w:rStyle w:val="Hyperlink"/>
@@ -12463,7 +12520,7 @@
         </w:rPr>
         <w:t xml:space="preserve"> Available from: </w:t>
       </w:r>
-      <w:hyperlink r:id="rId47" w:tgtFrame="_new" w:history="1">
+      <w:hyperlink r:id="rId49" w:tgtFrame="_new" w:history="1">
         <w:r>
           <w:rPr>
             <w:rStyle w:val="Hyperlink"/>
@@ -12543,7 +12600,7 @@
         <w:lastRenderedPageBreak/>
         <w:t xml:space="preserve">Available from: </w:t>
       </w:r>
-      <w:hyperlink r:id="rId48" w:anchor=":~:text=6.-,Be%20generous%20with%20your%20visuals.,instructional%20material%20for%20your%20learners" w:tgtFrame="_new" w:history="1">
+      <w:hyperlink r:id="rId50" w:anchor=":~:text=6.-,Be%20generous%20with%20your%20visuals.,instructional%20material%20for%20your%20learners" w:tgtFrame="_new" w:history="1">
         <w:r>
           <w:rPr>
             <w:rStyle w:val="Hyperlink"/>
@@ -12613,7 +12670,7 @@
         </w:rPr>
         <w:t xml:space="preserve"> Available from: </w:t>
       </w:r>
-      <w:hyperlink r:id="rId49" w:tgtFrame="_new" w:history="1">
+      <w:hyperlink r:id="rId51" w:tgtFrame="_new" w:history="1">
         <w:r>
           <w:rPr>
             <w:rStyle w:val="Hyperlink"/>
@@ -12683,7 +12740,7 @@
         </w:rPr>
         <w:t xml:space="preserve"> Available from: </w:t>
       </w:r>
-      <w:hyperlink r:id="rId50" w:anchor="Abs1" w:tgtFrame="_new" w:history="1">
+      <w:hyperlink r:id="rId52" w:anchor="Abs1" w:tgtFrame="_new" w:history="1">
         <w:r>
           <w:rPr>
             <w:rStyle w:val="Hyperlink"/>
@@ -12753,7 +12810,7 @@
         </w:rPr>
         <w:t xml:space="preserve"> Available from: </w:t>
       </w:r>
-      <w:hyperlink r:id="rId51" w:tgtFrame="_new" w:history="1">
+      <w:hyperlink r:id="rId53" w:tgtFrame="_new" w:history="1">
         <w:r>
           <w:rPr>
             <w:rStyle w:val="Hyperlink"/>
@@ -12823,7 +12880,7 @@
         </w:rPr>
         <w:t xml:space="preserve"> Available from: </w:t>
       </w:r>
-      <w:hyperlink r:id="rId52" w:anchor=":~:text=The%20human%20brain%20is%20constantly,brain%20tissue%20for%20medical%20reasons" w:tgtFrame="_new" w:history="1">
+      <w:hyperlink r:id="rId54" w:anchor=":~:text=The%20human%20brain%20is%20constantly,brain%20tissue%20for%20medical%20reasons" w:tgtFrame="_new" w:history="1">
         <w:r>
           <w:rPr>
             <w:rStyle w:val="Hyperlink"/>
@@ -12893,7 +12950,7 @@
         </w:rPr>
         <w:t xml:space="preserve"> Available from: </w:t>
       </w:r>
-      <w:hyperlink r:id="rId53" w:tgtFrame="_new" w:history="1">
+      <w:hyperlink r:id="rId55" w:tgtFrame="_new" w:history="1">
         <w:r>
           <w:rPr>
             <w:rStyle w:val="Hyperlink"/>
@@ -12963,7 +13020,7 @@
         </w:rPr>
         <w:t xml:space="preserve"> Available from: </w:t>
       </w:r>
-      <w:hyperlink r:id="rId54" w:tgtFrame="_new" w:history="1">
+      <w:hyperlink r:id="rId56" w:tgtFrame="_new" w:history="1">
         <w:r>
           <w:rPr>
             <w:rStyle w:val="Hyperlink"/>
@@ -13082,7 +13139,7 @@
         </w:rPr>
         <w:t xml:space="preserve"> Available from: </w:t>
       </w:r>
-      <w:hyperlink r:id="rId55" w:tgtFrame="_new" w:history="1">
+      <w:hyperlink r:id="rId57" w:tgtFrame="_new" w:history="1">
         <w:r>
           <w:rPr>
             <w:rStyle w:val="Hyperlink"/>
@@ -13152,7 +13209,7 @@
         </w:rPr>
         <w:t xml:space="preserve"> Available from: </w:t>
       </w:r>
-      <w:hyperlink r:id="rId56" w:tgtFrame="_new" w:history="1">
+      <w:hyperlink r:id="rId58" w:tgtFrame="_new" w:history="1">
         <w:r>
           <w:rPr>
             <w:rStyle w:val="Hyperlink"/>
@@ -13222,7 +13279,7 @@
         </w:rPr>
         <w:t xml:space="preserve"> Available from: </w:t>
       </w:r>
-      <w:hyperlink r:id="rId57" w:tgtFrame="_new" w:history="1">
+      <w:hyperlink r:id="rId59" w:tgtFrame="_new" w:history="1">
         <w:r>
           <w:rPr>
             <w:rStyle w:val="Hyperlink"/>
@@ -13292,7 +13349,7 @@
         </w:rPr>
         <w:t xml:space="preserve"> Available from: </w:t>
       </w:r>
-      <w:hyperlink r:id="rId58" w:tgtFrame="_new" w:history="1">
+      <w:hyperlink r:id="rId60" w:tgtFrame="_new" w:history="1">
         <w:r>
           <w:rPr>
             <w:rStyle w:val="Hyperlink"/>
@@ -13362,7 +13419,7 @@
         </w:rPr>
         <w:t xml:space="preserve"> Available from: </w:t>
       </w:r>
-      <w:hyperlink r:id="rId59" w:tgtFrame="_new" w:history="1">
+      <w:hyperlink r:id="rId61" w:tgtFrame="_new" w:history="1">
         <w:r>
           <w:rPr>
             <w:rStyle w:val="Hyperlink"/>
@@ -13432,7 +13489,7 @@
         </w:rPr>
         <w:t xml:space="preserve"> Available from: </w:t>
       </w:r>
-      <w:hyperlink r:id="rId60" w:tgtFrame="_new" w:history="1">
+      <w:hyperlink r:id="rId62" w:tgtFrame="_new" w:history="1">
         <w:r>
           <w:rPr>
             <w:rStyle w:val="Hyperlink"/>
@@ -13551,7 +13608,7 @@
         </w:rPr>
         <w:t xml:space="preserve"> Available from: </w:t>
       </w:r>
-      <w:hyperlink r:id="rId61" w:tgtFrame="_new" w:history="1">
+      <w:hyperlink r:id="rId63" w:tgtFrame="_new" w:history="1">
         <w:r>
           <w:rPr>
             <w:rStyle w:val="Hyperlink"/>
@@ -13621,7 +13678,7 @@
         </w:rPr>
         <w:t xml:space="preserve"> Available from: </w:t>
       </w:r>
-      <w:hyperlink r:id="rId62" w:tgtFrame="_new" w:history="1">
+      <w:hyperlink r:id="rId64" w:tgtFrame="_new" w:history="1">
         <w:r>
           <w:rPr>
             <w:rStyle w:val="Hyperlink"/>
@@ -13691,7 +13748,7 @@
         </w:rPr>
         <w:t xml:space="preserve"> Available from: </w:t>
       </w:r>
-      <w:hyperlink r:id="rId63" w:tgtFrame="_new" w:history="1">
+      <w:hyperlink r:id="rId65" w:tgtFrame="_new" w:history="1">
         <w:r>
           <w:rPr>
             <w:rStyle w:val="Hyperlink"/>
@@ -13761,7 +13818,7 @@
         </w:rPr>
         <w:t xml:space="preserve"> Available from: </w:t>
       </w:r>
-      <w:hyperlink r:id="rId64" w:tgtFrame="_new" w:history="1">
+      <w:hyperlink r:id="rId66" w:tgtFrame="_new" w:history="1">
         <w:r>
           <w:rPr>
             <w:rStyle w:val="Hyperlink"/>
@@ -13821,7 +13878,7 @@
         </w:rPr>
         <w:t xml:space="preserve"> Available from: </w:t>
       </w:r>
-      <w:hyperlink r:id="rId65" w:tgtFrame="_new" w:history="1">
+      <w:hyperlink r:id="rId67" w:tgtFrame="_new" w:history="1">
         <w:r>
           <w:rPr>
             <w:rStyle w:val="Hyperlink"/>
@@ -13892,7 +13949,7 @@
         </w:rPr>
         <w:t xml:space="preserve"> Available from: </w:t>
       </w:r>
-      <w:hyperlink r:id="rId66" w:tgtFrame="_new" w:history="1">
+      <w:hyperlink r:id="rId68" w:tgtFrame="_new" w:history="1">
         <w:r>
           <w:rPr>
             <w:rStyle w:val="Hyperlink"/>
@@ -14011,7 +14068,7 @@
         </w:rPr>
         <w:t xml:space="preserve"> Available from: </w:t>
       </w:r>
-      <w:hyperlink r:id="rId67" w:tgtFrame="_new" w:history="1">
+      <w:hyperlink r:id="rId69" w:tgtFrame="_new" w:history="1">
         <w:r>
           <w:rPr>
             <w:rStyle w:val="Hyperlink"/>
@@ -14081,7 +14138,7 @@
         </w:rPr>
         <w:t xml:space="preserve"> Available from: </w:t>
       </w:r>
-      <w:hyperlink r:id="rId68" w:tgtFrame="_new" w:history="1">
+      <w:hyperlink r:id="rId70" w:tgtFrame="_new" w:history="1">
         <w:r>
           <w:rPr>
             <w:rStyle w:val="Hyperlink"/>
@@ -14151,7 +14208,7 @@
         </w:rPr>
         <w:t xml:space="preserve"> Available from: </w:t>
       </w:r>
-      <w:hyperlink r:id="rId69" w:tgtFrame="_new" w:history="1">
+      <w:hyperlink r:id="rId71" w:tgtFrame="_new" w:history="1">
         <w:r>
           <w:rPr>
             <w:rStyle w:val="Hyperlink"/>
@@ -20570,7 +20627,7 @@
         </w:rPr>
         <w:t xml:space="preserve">Pixel Frog (Oct 17, 2019) Pixel Adventure 1. Available from: </w:t>
       </w:r>
-      <w:hyperlink r:id="rId70" w:history="1">
+      <w:hyperlink r:id="rId72" w:history="1">
         <w:r>
           <w:rPr>
             <w:rStyle w:val="Hyperlink"/>
@@ -20737,7 +20794,7 @@
             <wp:cNvGraphicFramePr/>
             <a:graphic xmlns:a="http://schemas.openxmlformats.org/drawingml/2006/main">
               <a:graphicData uri="http://schemas.openxmlformats.org/drawingml/2006/chart">
-                <c:chart xmlns:c="http://schemas.openxmlformats.org/drawingml/2006/chart" xmlns:r="http://schemas.openxmlformats.org/officeDocument/2006/relationships" r:id="rId71"/>
+                <c:chart xmlns:c="http://schemas.openxmlformats.org/drawingml/2006/chart" xmlns:r="http://schemas.openxmlformats.org/officeDocument/2006/relationships" r:id="rId73"/>
               </a:graphicData>
             </a:graphic>
             <wp14:sizeRelH relativeFrom="page">
@@ -21035,7 +21092,7 @@
             <wp:cNvGraphicFramePr/>
             <a:graphic xmlns:a="http://schemas.openxmlformats.org/drawingml/2006/main">
               <a:graphicData uri="http://schemas.openxmlformats.org/drawingml/2006/chart">
-                <c:chart xmlns:c="http://schemas.openxmlformats.org/drawingml/2006/chart" xmlns:r="http://schemas.openxmlformats.org/officeDocument/2006/relationships" r:id="rId72"/>
+                <c:chart xmlns:c="http://schemas.openxmlformats.org/drawingml/2006/chart" xmlns:r="http://schemas.openxmlformats.org/officeDocument/2006/relationships" r:id="rId74"/>
               </a:graphicData>
             </a:graphic>
             <wp14:sizeRelH relativeFrom="page">
@@ -21344,7 +21401,7 @@
             <wp:cNvGraphicFramePr/>
             <a:graphic xmlns:a="http://schemas.openxmlformats.org/drawingml/2006/main">
               <a:graphicData uri="http://schemas.openxmlformats.org/drawingml/2006/chart">
-                <c:chart xmlns:c="http://schemas.openxmlformats.org/drawingml/2006/chart" xmlns:r="http://schemas.openxmlformats.org/officeDocument/2006/relationships" r:id="rId73"/>
+                <c:chart xmlns:c="http://schemas.openxmlformats.org/drawingml/2006/chart" xmlns:r="http://schemas.openxmlformats.org/officeDocument/2006/relationships" r:id="rId75"/>
               </a:graphicData>
             </a:graphic>
           </wp:inline>
@@ -21456,7 +21513,7 @@
                     <pic:cNvPicPr/>
                   </pic:nvPicPr>
                   <pic:blipFill>
-                    <a:blip r:embed="rId74"/>
+                    <a:blip r:embed="rId76"/>
                     <a:stretch>
                       <a:fillRect/>
                     </a:stretch>
@@ -21527,7 +21584,7 @@
                     <pic:cNvPicPr/>
                   </pic:nvPicPr>
                   <pic:blipFill>
-                    <a:blip r:embed="rId75"/>
+                    <a:blip r:embed="rId77"/>
                     <a:stretch>
                       <a:fillRect/>
                     </a:stretch>
@@ -21579,7 +21636,7 @@
                     <pic:cNvPicPr/>
                   </pic:nvPicPr>
                   <pic:blipFill rotWithShape="1">
-                    <a:blip r:embed="rId76"/>
+                    <a:blip r:embed="rId78"/>
                     <a:srcRect b="1620"/>
                     <a:stretch/>
                   </pic:blipFill>
@@ -21637,7 +21694,7 @@
                     <pic:cNvPicPr/>
                   </pic:nvPicPr>
                   <pic:blipFill>
-                    <a:blip r:embed="rId77"/>
+                    <a:blip r:embed="rId79"/>
                     <a:stretch>
                       <a:fillRect/>
                     </a:stretch>
@@ -21752,7 +21809,7 @@
                     <pic:cNvPicPr/>
                   </pic:nvPicPr>
                   <pic:blipFill>
-                    <a:blip r:embed="rId78"/>
+                    <a:blip r:embed="rId80"/>
                     <a:stretch>
                       <a:fillRect/>
                     </a:stretch>
@@ -21800,7 +21857,7 @@
                     <pic:cNvPicPr/>
                   </pic:nvPicPr>
                   <pic:blipFill>
-                    <a:blip r:embed="rId79"/>
+                    <a:blip r:embed="rId81"/>
                     <a:stretch>
                       <a:fillRect/>
                     </a:stretch>
@@ -24206,7 +24263,6 @@
   <w:style w:type="character" w:default="1" w:styleId="DefaultParagraphFont">
     <w:name w:val="Default Paragraph Font"/>
     <w:uiPriority w:val="1"/>
-    <w:semiHidden/>
     <w:unhideWhenUsed/>
   </w:style>
   <w:style w:type="table" w:default="1" w:styleId="TableNormal">
@@ -28183,6 +28239,10 @@
 </file>
 
 <file path=customXml/item1.xml><?xml version="1.0" encoding="utf-8"?>
+<b:Sources xmlns:b="http://schemas.openxmlformats.org/officeDocument/2006/bibliography" xmlns="http://schemas.openxmlformats.org/officeDocument/2006/bibliography" SelectedStyle="/APA.XSL" StyleName="APA"/>
+</file>
+
+<file path=customXml/item2.xml><?xml version="1.0" encoding="utf-8"?>
 <ct:contentTypeSchema xmlns:ct="http://schemas.microsoft.com/office/2006/metadata/contentType" xmlns:ma="http://schemas.microsoft.com/office/2006/metadata/properties/metaAttributes" ct:_="" ma:_="" ma:contentTypeName="Document" ma:contentTypeID="0x0101001BC1D44B3665304E9EFFB6B26E5C1EDB" ma:contentTypeVersion="17" ma:contentTypeDescription="Create a new document." ma:contentTypeScope="" ma:versionID="ebe7ffaa3beae6c2692551344dbac989">
   <xsd:schema xmlns:xsd="http://www.w3.org/2001/XMLSchema" xmlns:xs="http://www.w3.org/2001/XMLSchema" xmlns:p="http://schemas.microsoft.com/office/2006/metadata/properties" xmlns:ns2="3ca5950f-9dc6-4fa2-8e6b-e8b0d1a55fc5" xmlns:ns3="da5699a2-2791-44c0-bb0a-d0c081c141e6" targetNamespace="http://schemas.microsoft.com/office/2006/metadata/properties" ma:root="true" ma:fieldsID="fbc6f3879e7a0016066cbb62231de351" ns2:_="" ns3:_="">
     <xsd:import namespace="3ca5950f-9dc6-4fa2-8e6b-e8b0d1a55fc5"/>
@@ -28438,7 +28498,16 @@
 </ct:contentTypeSchema>
 </file>
 
-<file path=customXml/item2.xml><?xml version="1.0" encoding="utf-8"?>
+<file path=customXml/item3.xml><?xml version="1.0" encoding="utf-8"?>
+<?mso-contentType ?>
+<FormTemplates xmlns="http://schemas.microsoft.com/sharepoint/v3/contenttype/forms">
+  <Display>DocumentLibraryForm</Display>
+  <Edit>DocumentLibraryForm</Edit>
+  <New>DocumentLibraryForm</New>
+</FormTemplates>
+</file>
+
+<file path=customXml/item4.xml><?xml version="1.0" encoding="utf-8"?>
 <p:properties xmlns:p="http://schemas.microsoft.com/office/2006/metadata/properties" xmlns:xsi="http://www.w3.org/2001/XMLSchema-instance" xmlns:pc="http://schemas.microsoft.com/office/infopath/2007/PartnerControls">
   <documentManagement>
     <lcf76f155ced4ddcb4097134ff3c332f xmlns="3ca5950f-9dc6-4fa2-8e6b-e8b0d1a55fc5">
@@ -28453,20 +28522,15 @@
 </p:properties>
 </file>
 
-<file path=customXml/item3.xml><?xml version="1.0" encoding="utf-8"?>
-<b:Sources xmlns:b="http://schemas.openxmlformats.org/officeDocument/2006/bibliography" xmlns="http://schemas.openxmlformats.org/officeDocument/2006/bibliography" SelectedStyle="/APA.XSL" StyleName="APA"/>
+<file path=customXml/itemProps1.xml><?xml version="1.0" encoding="utf-8"?>
+<ds:datastoreItem xmlns:ds="http://schemas.openxmlformats.org/officeDocument/2006/customXml" ds:itemID="{191EA17E-4FF3-6543-9328-B87A43C2CF01}">
+  <ds:schemaRefs>
+    <ds:schemaRef ds:uri="http://schemas.openxmlformats.org/officeDocument/2006/bibliography"/>
+  </ds:schemaRefs>
+</ds:datastoreItem>
 </file>
 
-<file path=customXml/item4.xml><?xml version="1.0" encoding="utf-8"?>
-<?mso-contentType ?>
-<FormTemplates xmlns="http://schemas.microsoft.com/sharepoint/v3/contenttype/forms">
-  <Display>DocumentLibraryForm</Display>
-  <Edit>DocumentLibraryForm</Edit>
-  <New>DocumentLibraryForm</New>
-</FormTemplates>
-</file>
-
-<file path=customXml/itemProps1.xml><?xml version="1.0" encoding="utf-8"?>
+<file path=customXml/itemProps2.xml><?xml version="1.0" encoding="utf-8"?>
 <ds:datastoreItem xmlns:ds="http://schemas.openxmlformats.org/officeDocument/2006/customXml" ds:itemID="{F6547193-3E93-40A7-96AB-43C0DF37402B}">
   <ds:schemaRefs>
     <ds:schemaRef ds:uri="http://schemas.microsoft.com/office/2006/metadata/contentType"/>
@@ -28485,7 +28549,15 @@
 </ds:datastoreItem>
 </file>
 
-<file path=customXml/itemProps2.xml><?xml version="1.0" encoding="utf-8"?>
+<file path=customXml/itemProps3.xml><?xml version="1.0" encoding="utf-8"?>
+<ds:datastoreItem xmlns:ds="http://schemas.openxmlformats.org/officeDocument/2006/customXml" ds:itemID="{CE597715-63E8-4A9F-B3CC-57F27D3DCBFB}">
+  <ds:schemaRefs>
+    <ds:schemaRef ds:uri="http://schemas.microsoft.com/sharepoint/v3/contenttype/forms"/>
+  </ds:schemaRefs>
+</ds:datastoreItem>
+</file>
+
+<file path=customXml/itemProps4.xml><?xml version="1.0" encoding="utf-8"?>
 <ds:datastoreItem xmlns:ds="http://schemas.openxmlformats.org/officeDocument/2006/customXml" ds:itemID="{37169F2F-1A49-4A9E-A13A-BBD6F4DE6A1B}">
   <ds:schemaRefs>
     <ds:schemaRef ds:uri="http://schemas.microsoft.com/office/2006/metadata/properties"/>
@@ -28494,20 +28566,4 @@
     <ds:schemaRef ds:uri="da5699a2-2791-44c0-bb0a-d0c081c141e6"/>
   </ds:schemaRefs>
 </ds:datastoreItem>
-</file>
-
-<file path=customXml/itemProps3.xml><?xml version="1.0" encoding="utf-8"?>
-<ds:datastoreItem xmlns:ds="http://schemas.openxmlformats.org/officeDocument/2006/customXml" ds:itemID="{191EA17E-4FF3-6543-9328-B87A43C2CF01}">
-  <ds:schemaRefs>
-    <ds:schemaRef ds:uri="http://schemas.openxmlformats.org/officeDocument/2006/bibliography"/>
-  </ds:schemaRefs>
-</ds:datastoreItem>
-</file>
-
-<file path=customXml/itemProps4.xml><?xml version="1.0" encoding="utf-8"?>
-<ds:datastoreItem xmlns:ds="http://schemas.openxmlformats.org/officeDocument/2006/customXml" ds:itemID="{CE597715-63E8-4A9F-B3CC-57F27D3DCBFB}">
-  <ds:schemaRefs>
-    <ds:schemaRef ds:uri="http://schemas.microsoft.com/sharepoint/v3/contenttype/forms"/>
-  </ds:schemaRefs>
-</ds:datastoreItem>
 </file>
</xml_diff>